<commit_message>
Fix Stage 4 Amaka alignment type
</commit_message>
<xml_diff>
--- a/public/capstone/stage-3/stage-3-incident-report-template.docx
+++ b/public/capstone/stage-3/stage-3-incident-report-template.docx
@@ -23,7 +23,7 @@
           <w:i/>
           <w:iCs/>
         </w:rPr>
-        <w:t xml:space="preserve">Editable template — Deliverable 5 of 5: The formal incident report. This is the cover report for the CISO and Legal — it folds in your triage, timeline, IOCs, and ATT&amp;CK map and tells the story a non-analyst can act and decide on. Target length 5–7 pages. Edit in Google Docs (recommended). Replace every [BRACKETED] prompt and delete every grey guidance line before you submit.</w:t>
+        <w:t xml:space="preserve">Editable template — Deliverable 5 of 5: The Incident Response Report (PICERL). This is the document Sankofa’s response stands or falls on — Legal, the board, and the regulator all read it. It follows the NIST SP 800-61r2 PICERL lifecycle, and it folds in your triage, timeline, IOCs, and ATT&amp;CK map. Minimum 1,500 words. Submit the Google Doc link + a 100+ word abstract in the answer box. Edit in Google Docs (recommended). Replace every [BRACKETED] prompt and delete every grey guidance line before you submit.</w:t>
       </w:r>
     </w:p>
     <w:p>
@@ -33,13 +33,13 @@
         </w:pict>
       </w:r>
     </w:p>
-    <w:bookmarkStart w:id="14" w:name="deliverable-5-the-formal-incident-report"/>
+    <w:bookmarkStart w:id="14" w:name="Xe1979b2d58810cfc48621bf922a469865bf1d52"/>
     <w:p>
       <w:pPr>
         <w:pStyle w:val="Heading1"/>
       </w:pPr>
       <w:r>
-        <w:t xml:space="preserve">Deliverable 5 — The formal incident report</w:t>
+        <w:t xml:space="preserve">Deliverable 5 — Incident Response Report (PICERL)</w:t>
       </w:r>
     </w:p>
     <w:bookmarkStart w:id="9" w:name="before-you-start"/>
@@ -70,13 +70,13 @@
           <w:b/>
           <w:bCs/>
         </w:rPr>
-        <w:t xml:space="preserve">CISO + Legal.</w:t>
-      </w:r>
-      <w:r>
-        <w:t xml:space="preserve"> </w:t>
-      </w:r>
-      <w:r>
-        <w:t xml:space="preserve">They need the facts, the impact, and the decisions — not raw log lines. Keep the analyst detail in D1–D4 and reference it.</w:t>
+        <w:t xml:space="preserve">Legal, the board, the regulator.</w:t>
+      </w:r>
+      <w:r>
+        <w:t xml:space="preserve"> </w:t>
+      </w:r>
+      <w:r>
+        <w:t xml:space="preserve">Facts, impact, decisions — keep raw log lines in the appendix and reference them.</w:t>
       </w:r>
     </w:p>
     <w:p>
@@ -88,6 +88,34 @@
         </w:numPr>
       </w:pPr>
       <w:r>
+        <w:t xml:space="preserve">Use the</w:t>
+      </w:r>
+      <w:r>
+        <w:t xml:space="preserve"> </w:t>
+      </w:r>
+      <w:r>
+        <w:rPr>
+          <w:b/>
+          <w:bCs/>
+        </w:rPr>
+        <w:t xml:space="preserve">exact section headings below, in this order</w:t>
+      </w:r>
+      <w:r>
+        <w:t xml:space="preserve"> </w:t>
+      </w:r>
+      <w:r>
+        <w:t xml:space="preserve">(NIST SP 800-61r2 PICERL). Graders look for them by name.</w:t>
+      </w:r>
+    </w:p>
+    <w:p>
+      <w:pPr>
+        <w:pStyle w:val="Compact"/>
+        <w:numPr>
+          <w:ilvl w:val="0"/>
+          <w:numId w:val="1001"/>
+        </w:numPr>
+      </w:pPr>
+      <w:r>
         <w:t xml:space="preserve">It must be</w:t>
       </w:r>
       <w:r>
@@ -104,7 +132,7 @@
         <w:t xml:space="preserve"> </w:t>
       </w:r>
       <w:r>
-        <w:t xml:space="preserve">with your other four deliverables: the timeline, the IOCs, and the root cause should match what you submitted there.</w:t>
+        <w:t xml:space="preserve">with your D1–D4: the timeline, the IOCs, the root cause all match.</w:t>
       </w:r>
     </w:p>
     <w:p>
@@ -116,29 +144,17 @@
         </w:numPr>
       </w:pPr>
       <w:r>
-        <w:t xml:space="preserve">Root cause is a</w:t>
-      </w:r>
-      <w:r>
-        <w:t xml:space="preserve"> </w:t>
-      </w:r>
-      <w:r>
-        <w:rPr>
-          <w:b/>
-          <w:bCs/>
-        </w:rPr>
-        <w:t xml:space="preserve">cause, not a symptom.</w:t>
-      </w:r>
-      <w:r>
-        <w:t xml:space="preserve"> </w:t>
-      </w:r>
-      <w:r>
-        <w:t xml:space="preserve">“Malware ran”</w:t>
-      </w:r>
-      <w:r>
-        <w:t xml:space="preserve"> </w:t>
-      </w:r>
-      <w:r>
-        <w:t xml:space="preserve">is a symptom; the cause is how the attacker got a foothold and how that became persistent root.</w:t>
+        <w:rPr>
+          <w:b/>
+          <w:bCs/>
+        </w:rPr>
+        <w:t xml:space="preserve">Minimum 1,500 words.</w:t>
+      </w:r>
+      <w:r>
+        <w:t xml:space="preserve"> </w:t>
+      </w:r>
+      <w:r>
+        <w:t xml:space="preserve">No section shorter than two sentences; no section longer than ~350 words except the appendix and the timeline.</w:t>
       </w:r>
     </w:p>
     <w:p>
@@ -150,23 +166,33 @@
         </w:numPr>
       </w:pPr>
       <w:r>
-        <w:t xml:space="preserve">Be exact about</w:t>
-      </w:r>
-      <w:r>
-        <w:t xml:space="preserve"> </w:t>
-      </w:r>
-      <w:r>
-        <w:rPr>
-          <w:b/>
-          <w:bCs/>
-        </w:rPr>
-        <w:t xml:space="preserve">what was accessed</w:t>
-      </w:r>
-      <w:r>
-        <w:t xml:space="preserve"> </w:t>
-      </w:r>
-      <w:r>
-        <w:t xml:space="preserve">— name the data that left the host. Legal acts on this.</w:t>
+        <w:rPr>
+          <w:b/>
+          <w:bCs/>
+        </w:rPr>
+        <w:t xml:space="preserve">Citations required (8+):</w:t>
+      </w:r>
+      <w:r>
+        <w:t xml:space="preserve"> </w:t>
+      </w:r>
+      <w:r>
+        <w:t xml:space="preserve">NIST SP 800-61r2 by section number, 4+ MITRE ATT&amp;CK technique IDs, 1+ CISA playbook, 1+ detection-engineering reference (Sigma / Wazuh / osquery / Falco / Atomic Red Team), and one sentence flagging</w:t>
+      </w:r>
+      <w:r>
+        <w:t xml:space="preserve"> </w:t>
+      </w:r>
+      <w:r>
+        <w:rPr>
+          <w:b/>
+          <w:bCs/>
+        </w:rPr>
+        <w:t xml:space="preserve">NDPA 2023 §40</w:t>
+      </w:r>
+      <w:r>
+        <w:t xml:space="preserve"> </w:t>
+      </w:r>
+      <w:r>
+        <w:t xml:space="preserve">applicability.</w:t>
       </w:r>
     </w:p>
     <w:p>
@@ -174,7 +200,7 @@
         <w:pStyle w:val="BlockText"/>
       </w:pPr>
       <w:r>
-        <w:t xml:space="preserve">This is a scaffold, not an answer key. The analysis is yours; this gives you the section order graders expect.</w:t>
+        <w:t xml:space="preserve">This is a scaffold, not an answer key. The analysis is yours; this gives you the section order and the bar graders expect.</w:t>
       </w:r>
     </w:p>
     <w:p>
@@ -199,49 +225,150 @@
         <w:pStyle w:val="FirstParagraph"/>
       </w:pPr>
       <w:r>
-        <w:t xml:space="preserve">A 5–7 page document (</w:t>
-      </w:r>
+        <w:t xml:space="preserve">A Google Doc (≥1,500 words), sharing set to</w:t>
+      </w:r>
+      <w:r>
+        <w:t xml:space="preserve"> </w:t>
+      </w:r>
+      <w:r>
+        <w:rPr>
+          <w:b/>
+          <w:bCs/>
+        </w:rPr>
+        <w:t xml:space="preserve">“Anyone with the link → Viewer.”</w:t>
+      </w:r>
+      <w:r>
+        <w:t xml:space="preserve"> </w:t>
+      </w:r>
+      <w:r>
+        <w:t xml:space="preserve">In the answer box paste the</w:t>
+      </w:r>
+      <w:r>
+        <w:t xml:space="preserve"> </w:t>
+      </w:r>
+      <w:r>
+        <w:rPr>
+          <w:b/>
+          <w:bCs/>
+        </w:rPr>
+        <w:t xml:space="preserve">Doc URL + a 100+ word abstract</w:t>
+      </w:r>
+      <w:r>
+        <w:t xml:space="preserve">. The report itself contains the sections below.</w:t>
+      </w:r>
+    </w:p>
+    <w:p>
+      <w:pPr>
+        <w:pStyle w:val="BodyText"/>
+      </w:pPr>
+      <w:r>
+        <w:rPr>
+          <w:b/>
+          <w:bCs/>
+        </w:rPr>
+        <w:t xml:space="preserve">First line of your document:</w:t>
+      </w:r>
+    </w:p>
+    <w:p>
+      <w:pPr>
+        <w:pStyle w:val="BodyText"/>
+      </w:pPr>
       <w:r>
         <w:rPr>
           <w:rStyle w:val="VerbatimChar"/>
         </w:rPr>
-        <w:t xml:space="preserve">incident-report</w:t>
-      </w:r>
-      <w:r>
-        <w:t xml:space="preserve">) with the sections below, in this order.</w:t>
-      </w:r>
-    </w:p>
-    <w:p>
-      <w:pPr>
-        <w:pStyle w:val="BodyText"/>
-      </w:pPr>
-      <w:r>
-        <w:rPr>
-          <w:b/>
-          <w:bCs/>
-        </w:rPr>
-        <w:t xml:space="preserve">First line of your document:</w:t>
-      </w:r>
-    </w:p>
-    <w:p>
-      <w:pPr>
-        <w:pStyle w:val="BodyText"/>
-      </w:pPr>
+        <w:t xml:space="preserve">Stage 3 · Incident report · [Your Full Name] · [UBI-2026-####]</w:t>
+      </w:r>
+    </w:p>
+    <w:bookmarkEnd w:id="10"/>
+    <w:bookmarkStart w:id="13" w:name="Xdbdc1bd9007e2664e3d21c161e034ca6902b750"/>
+    <w:p>
+      <w:pPr>
+        <w:pStyle w:val="Heading2"/>
+      </w:pPr>
+      <w:r>
+        <w:t xml:space="preserve">Required sections (these headings, in this order)</w:t>
+      </w:r>
+    </w:p>
+    <w:p>
+      <w:pPr>
+        <w:pStyle w:val="Compact"/>
+        <w:numPr>
+          <w:ilvl w:val="0"/>
+          <w:numId w:val="1002"/>
+        </w:numPr>
+      </w:pPr>
+      <w:r>
+        <w:rPr>
+          <w:b/>
+          <w:bCs/>
+        </w:rPr>
+        <w:t xml:space="preserve">Executive summary</w:t>
+      </w:r>
+      <w:r>
+        <w:t xml:space="preserve"> </w:t>
+      </w:r>
+      <w:r>
+        <w:t xml:space="preserve">(≤200 words) — [what happened in plain language, what was lost/exposed, what is contained, what is NOT yet contained, and the action the board is asked to authorise. A reader who stops here can still brief their boss.]</w:t>
+      </w:r>
+    </w:p>
+    <w:p>
+      <w:pPr>
+        <w:pStyle w:val="Compact"/>
+        <w:numPr>
+          <w:ilvl w:val="0"/>
+          <w:numId w:val="1002"/>
+        </w:numPr>
+      </w:pPr>
+      <w:r>
+        <w:rPr>
+          <w:b/>
+          <w:bCs/>
+        </w:rPr>
+        <w:t xml:space="preserve">Scope</w:t>
+      </w:r>
+      <w:r>
+        <w:t xml:space="preserve"> </w:t>
+      </w:r>
+      <w:r>
+        <w:t xml:space="preserve">— [hosts, users, and data classes in scope (and out of scope) — one short paragraph each.]</w:t>
+      </w:r>
+    </w:p>
+    <w:p>
+      <w:pPr>
+        <w:pStyle w:val="Compact"/>
+        <w:numPr>
+          <w:ilvl w:val="0"/>
+          <w:numId w:val="1002"/>
+        </w:numPr>
+      </w:pPr>
+      <w:r>
+        <w:rPr>
+          <w:b/>
+          <w:bCs/>
+        </w:rPr>
+        <w:t xml:space="preserve">Preparation — what worked / what didn’t</w:t>
+      </w:r>
+      <w:r>
+        <w:t xml:space="preserve"> </w:t>
+      </w:r>
+      <w:r>
+        <w:t xml:space="preserve">— [Sankofa’s pre-incident posture. Did detection catch the beacon? Was the</w:t>
+      </w:r>
+      <w:r>
+        <w:t xml:space="preserve"> </w:t>
+      </w:r>
       <w:r>
         <w:rPr>
           <w:rStyle w:val="VerbatimChar"/>
         </w:rPr>
-        <w:t xml:space="preserve">Stage 3 · Incident report · [Your Full Name] · [UBI-2026-####]</w:t>
-      </w:r>
-    </w:p>
-    <w:bookmarkEnd w:id="10"/>
-    <w:bookmarkStart w:id="13" w:name="section-order-use-these-headings"/>
-    <w:p>
-      <w:pPr>
-        <w:pStyle w:val="Heading2"/>
-      </w:pPr>
-      <w:r>
-        <w:t xml:space="preserve">Section order (use these headings)</w:t>
+        <w:t xml:space="preserve">sudoers.d</w:t>
+      </w:r>
+      <w:r>
+        <w:t xml:space="preserve"> </w:t>
+      </w:r>
+      <w:r>
+        <w:t xml:space="preserve">change reviewed? Cite the evidence for each control that was present or absent.]</w:t>
       </w:r>
     </w:p>
     <w:p>
@@ -257,13 +384,13 @@
           <w:b/>
           <w:bCs/>
         </w:rPr>
-        <w:t xml:space="preserve">Executive summary</w:t>
-      </w:r>
-      <w:r>
-        <w:t xml:space="preserve"> </w:t>
-      </w:r>
-      <w:r>
-        <w:t xml:space="preserve">— [6–10 lines a CISO/Legal reader understands with no jargon: what happened, on which host, what data was at risk, and the one decision or action that matters most.]</w:t>
+        <w:t xml:space="preserve">Identification — how we found it</w:t>
+      </w:r>
+      <w:r>
+        <w:t xml:space="preserve"> </w:t>
+      </w:r>
+      <w:r>
+        <w:t xml:space="preserve">— [the detection that triggered investigation; the forensic artefacts you pulled (memory dump, filesystem index, syslog, SIEM, netflow); chain of custody.]</w:t>
       </w:r>
     </w:p>
     <w:p>
@@ -279,13 +406,13 @@
           <w:b/>
           <w:bCs/>
         </w:rPr>
-        <w:t xml:space="preserve">Scope</w:t>
-      </w:r>
-      <w:r>
-        <w:t xml:space="preserve"> </w:t>
-      </w:r>
-      <w:r>
-        <w:t xml:space="preserve">— [the host(s), the user account, the time window, and what was in and out of scope for this investigation.]</w:t>
+        <w:t xml:space="preserve">Containment — what stopped the bleeding</w:t>
+      </w:r>
+      <w:r>
+        <w:t xml:space="preserve"> </w:t>
+      </w:r>
+      <w:r>
+        <w:t xml:space="preserve">— [hosts isolated, credentials rotated, network rules pushed, and the ORDER you did them in — justify each ordering choice.]</w:t>
       </w:r>
     </w:p>
     <w:p>
@@ -301,13 +428,67 @@
           <w:b/>
           <w:bCs/>
         </w:rPr>
-        <w:t xml:space="preserve">Timeline (summary)</w:t>
-      </w:r>
-      <w:r>
-        <w:t xml:space="preserve"> </w:t>
-      </w:r>
-      <w:r>
-        <w:t xml:space="preserve">— [the condensed version of D2 — the key events in order. Reference the full timeline deliverable; do not paste all rows.]</w:t>
+        <w:t xml:space="preserve">Eradication — what got removed</w:t>
+      </w:r>
+      <w:r>
+        <w:t xml:space="preserve"> </w:t>
+      </w:r>
+      <w:r>
+        <w:t xml:space="preserve">— [the persistence removed (the</w:t>
+      </w:r>
+      <w:r>
+        <w:t xml:space="preserve"> </w:t>
+      </w:r>
+      <w:r>
+        <w:rPr>
+          <w:rStyle w:val="VerbatimChar"/>
+        </w:rPr>
+        <w:t xml:space="preserve">.bashrc</w:t>
+      </w:r>
+      <w:r>
+        <w:t xml:space="preserve"> </w:t>
+      </w:r>
+      <w:r>
+        <w:rPr>
+          <w:rStyle w:val="VerbatimChar"/>
+        </w:rPr>
+        <w:t xml:space="preserve">source</w:t>
+      </w:r>
+      <w:r>
+        <w:t xml:space="preserve"> </w:t>
+      </w:r>
+      <w:r>
+        <w:t xml:space="preserve">line, the</w:t>
+      </w:r>
+      <w:r>
+        <w:t xml:space="preserve"> </w:t>
+      </w:r>
+      <w:r>
+        <w:rPr>
+          <w:rStyle w:val="VerbatimChar"/>
+        </w:rPr>
+        <w:t xml:space="preserve">.helper</w:t>
+      </w:r>
+      <w:r>
+        <w:t xml:space="preserve"> </w:t>
+      </w:r>
+      <w:r>
+        <w:t xml:space="preserve">binary, the autostart entry, the cron); the sudoers entry fixed; any pivoted credentials revoked; the C2 domain</w:t>
+      </w:r>
+      <w:r>
+        <w:t xml:space="preserve"> </w:t>
+      </w:r>
+      <w:r>
+        <w:rPr>
+          <w:rStyle w:val="VerbatimChar"/>
+        </w:rPr>
+        <w:t xml:space="preserve">gri0t-c2.dynamic-update.net</w:t>
+      </w:r>
+      <w:r>
+        <w:t xml:space="preserve"> </w:t>
+      </w:r>
+      <w:r>
+        <w:t xml:space="preserve">sinkholed/blocked.]</w:t>
       </w:r>
     </w:p>
     <w:p>
@@ -323,13 +504,13 @@
           <w:b/>
           <w:bCs/>
         </w:rPr>
-        <w:t xml:space="preserve">Root cause</w:t>
-      </w:r>
-      <w:r>
-        <w:t xml:space="preserve"> </w:t>
-      </w:r>
-      <w:r>
-        <w:t xml:space="preserve">— [how the attacker got in and how that became persistent root access. Cause, not symptom. Tie it to the evidence.]</w:t>
+        <w:t xml:space="preserve">Recovery — how we returned to normal</w:t>
+      </w:r>
+      <w:r>
+        <w:t xml:space="preserve"> </w:t>
+      </w:r>
+      <w:r>
+        <w:t xml:space="preserve">— [reimage vs in-place clean; restore vs rebuild; the validation step that confirmed eradication (fresh image, fresh keys, monitored 72h with no beacons).]</w:t>
       </w:r>
     </w:p>
     <w:p>
@@ -345,13 +526,13 @@
           <w:b/>
           <w:bCs/>
         </w:rPr>
-        <w:t xml:space="preserve">What was accessed / impact</w:t>
-      </w:r>
-      <w:r>
-        <w:t xml:space="preserve"> </w:t>
-      </w:r>
-      <w:r>
-        <w:t xml:space="preserve">— [name the data that was bundled and exfiltrated, and the business impact. Be specific about the files and what they contained.]</w:t>
+        <w:t xml:space="preserve">Lessons learned — three actions</w:t>
+      </w:r>
+      <w:r>
+        <w:t xml:space="preserve"> </w:t>
+      </w:r>
+      <w:r>
+        <w:t xml:space="preserve">— [three concrete actions, each with a named owner ROLE and a deadline, each backed by an artefact in this incident. Not platitudes.]</w:t>
       </w:r>
     </w:p>
     <w:p>
@@ -367,13 +548,41 @@
           <w:b/>
           <w:bCs/>
         </w:rPr>
-        <w:t xml:space="preserve">Containment</w:t>
-      </w:r>
-      <w:r>
-        <w:t xml:space="preserve"> </w:t>
-      </w:r>
-      <w:r>
-        <w:t xml:space="preserve">— [what was done to stop it — e.g. host isolation — with the timestamp, and what should happen next.]</w:t>
+        <w:t xml:space="preserve">Timeline table</w:t>
+      </w:r>
+      <w:r>
+        <w:t xml:space="preserve"> </w:t>
+      </w:r>
+      <w:r>
+        <w:t xml:space="preserve">— [reuse/refine your D2 timeline. Columns exactly:</w:t>
+      </w:r>
+      <w:r>
+        <w:t xml:space="preserve"> </w:t>
+      </w:r>
+      <w:r>
+        <w:rPr>
+          <w:rStyle w:val="VerbatimChar"/>
+        </w:rPr>
+        <w:t xml:space="preserve">Timestamp UTC | Event | Evidence (path or tab:timestamp) | ATT&amp;CK ID | Confidence (H/M/L) | Confidence rationale (≤25 words)</w:t>
+      </w:r>
+      <w:r>
+        <w:t xml:space="preserve">.</w:t>
+      </w:r>
+      <w:r>
+        <w:t xml:space="preserve"> </w:t>
+      </w:r>
+      <w:r>
+        <w:rPr>
+          <w:b/>
+          <w:bCs/>
+        </w:rPr>
+        <w:t xml:space="preserve">Minimum 12 rows.</w:t>
+      </w:r>
+      <w:r>
+        <w:t xml:space="preserve"> </w:t>
+      </w:r>
+      <w:r>
+        <w:t xml:space="preserve">H = direct evidence; M = correlated/indirect; L = inferred from absence. A table that is all H is wrong — real IR has uncertainty.]</w:t>
       </w:r>
     </w:p>
     <w:p>
@@ -389,13 +598,29 @@
           <w:b/>
           <w:bCs/>
         </w:rPr>
-        <w:t xml:space="preserve">Eradication</w:t>
-      </w:r>
-      <w:r>
-        <w:t xml:space="preserve"> </w:t>
-      </w:r>
-      <w:r>
-        <w:t xml:space="preserve">— [removing the foothold: the persistence mechanism(s), the attacker’s access path, and any credentials/keys that must be rotated.]</w:t>
+        <w:t xml:space="preserve">ATT&amp;CK map summary</w:t>
+      </w:r>
+      <w:r>
+        <w:t xml:space="preserve"> </w:t>
+      </w:r>
+      <w:r>
+        <w:t xml:space="preserve">— [reference your D4; restate the</w:t>
+      </w:r>
+      <w:r>
+        <w:t xml:space="preserve"> </w:t>
+      </w:r>
+      <w:r>
+        <w:rPr>
+          <w:b/>
+          <w:bCs/>
+        </w:rPr>
+        <w:t xml:space="preserve">top 6</w:t>
+      </w:r>
+      <w:r>
+        <w:t xml:space="preserve"> </w:t>
+      </w:r>
+      <w:r>
+        <w:t xml:space="preserve">techniques here with a one-line justification each.]</w:t>
       </w:r>
     </w:p>
     <w:p>
@@ -411,13 +636,31 @@
           <w:b/>
           <w:bCs/>
         </w:rPr>
-        <w:t xml:space="preserve">Lessons learned</w:t>
-      </w:r>
-      <w:r>
-        <w:t xml:space="preserve"> </w:t>
-      </w:r>
-      <w:r>
-        <w:t xml:space="preserve">— [what the incident exposed about detection and response gaps — specific, not platitudes.]</w:t>
+        <w:t xml:space="preserve">Risk register update</w:t>
+      </w:r>
+      <w:r>
+        <w:t xml:space="preserve"> </w:t>
+      </w:r>
+      <w:r>
+        <w:t xml:space="preserve">— [three NEW risks this incident surfaces — e.g. </w:t>
+      </w:r>
+      <w:r>
+        <w:t xml:space="preserve">“unreviewed sudoers grants survive indefinitely”</w:t>
+      </w:r>
+      <w:r>
+        <w:t xml:space="preserve"> </w:t>
+      </w:r>
+      <w:r>
+        <w:t xml:space="preserve">— each with likelihood × impact and a proposed control. Not</w:t>
+      </w:r>
+      <w:r>
+        <w:t xml:space="preserve"> </w:t>
+      </w:r>
+      <w:r>
+        <w:t xml:space="preserve">“we got breached.”</w:t>
+      </w:r>
+      <w:r>
+        <w:t xml:space="preserve">]</w:t>
       </w:r>
     </w:p>
     <w:p>
@@ -433,13 +676,116 @@
           <w:b/>
           <w:bCs/>
         </w:rPr>
-        <w:t xml:space="preserve">Policy changes proposed</w:t>
-      </w:r>
-      <w:r>
-        <w:t xml:space="preserve"> </w:t>
-      </w:r>
-      <w:r>
-        <w:t xml:space="preserve">— [concrete changes — access control, logging/alerting, key hygiene — each tied to something this incident proved.]</w:t>
+        <w:t xml:space="preserve">References (8+)</w:t>
+      </w:r>
+      <w:r>
+        <w:t xml:space="preserve"> </w:t>
+      </w:r>
+      <w:r>
+        <w:t xml:space="preserve">— [NIST SP 800-61r2 by section (e.g. §2 lifecycle, §3.3.4 containment); 4+ MITRE ATT&amp;CK IDs; 1+ CISA playbook; 1+ detection reference; NDPA 2023 §40 with a one-line note on whether this breach meets the notification threshold.]</w:t>
+      </w:r>
+    </w:p>
+    <w:p>
+      <w:pPr>
+        <w:pStyle w:val="Compact"/>
+        <w:numPr>
+          <w:ilvl w:val="0"/>
+          <w:numId w:val="1002"/>
+        </w:numPr>
+      </w:pPr>
+      <w:r>
+        <w:rPr>
+          <w:b/>
+          <w:bCs/>
+        </w:rPr>
+        <w:t xml:space="preserve">Evidence appendix</w:t>
+      </w:r>
+      <w:r>
+        <w:t xml:space="preserve"> </w:t>
+      </w:r>
+      <w:r>
+        <w:t xml:space="preserve">— [every file, tab, timestamp, command, ATT&amp;CK ID, and external reference cited above, in one numbered list.]</w:t>
+      </w:r>
+    </w:p>
+    <w:p>
+      <w:pPr>
+        <w:pStyle w:val="Compact"/>
+        <w:numPr>
+          <w:ilvl w:val="0"/>
+          <w:numId w:val="1002"/>
+        </w:numPr>
+      </w:pPr>
+      <w:r>
+        <w:rPr>
+          <w:b/>
+          <w:bCs/>
+        </w:rPr>
+        <w:t xml:space="preserve">Rejected alternate theory</w:t>
+      </w:r>
+      <w:r>
+        <w:t xml:space="preserve"> </w:t>
+      </w:r>
+      <w:r>
+        <w:t xml:space="preserve">(80+ words) — [one plausible explanation you considered and REJECTED, with the artefact that ruled it out. Generic</w:t>
+      </w:r>
+      <w:r>
+        <w:t xml:space="preserve"> </w:t>
+      </w:r>
+      <w:r>
+        <w:t xml:space="preserve">“I considered other theories”</w:t>
+      </w:r>
+      <w:r>
+        <w:t xml:space="preserve"> </w:t>
+      </w:r>
+      <w:r>
+        <w:t xml:space="preserve">scores zero. Example shape:</w:t>
+      </w:r>
+      <w:r>
+        <w:t xml:space="preserve"> </w:t>
+      </w:r>
+      <w:r>
+        <w:t xml:space="preserve">“I considered direct insider abuse by o.adegoke — ruled out by [the artefact that disproves it].”</w:t>
+      </w:r>
+      <w:r>
+        <w:t xml:space="preserve">]</w:t>
+      </w:r>
+    </w:p>
+    <w:p>
+      <w:pPr>
+        <w:pStyle w:val="Compact"/>
+        <w:numPr>
+          <w:ilvl w:val="0"/>
+          <w:numId w:val="1002"/>
+        </w:numPr>
+      </w:pPr>
+      <w:r>
+        <w:rPr>
+          <w:b/>
+          <w:bCs/>
+        </w:rPr>
+        <w:t xml:space="preserve">One mistake I almost made</w:t>
+      </w:r>
+      <w:r>
+        <w:t xml:space="preserve"> </w:t>
+      </w:r>
+      <w:r>
+        <w:t xml:space="preserve">(80+ words) — [a specific drafting moment: the order of containment vs eradication, nearly understating the blast radius, or missing logs misleading you. This goes</w:t>
+      </w:r>
+      <w:r>
+        <w:t xml:space="preserve"> </w:t>
+      </w:r>
+      <w:r>
+        <w:rPr>
+          <w:b/>
+          <w:bCs/>
+        </w:rPr>
+        <w:t xml:space="preserve">inside the Doc</w:t>
+      </w:r>
+      <w:r>
+        <w:t xml:space="preserve"> </w:t>
+      </w:r>
+      <w:r>
+        <w:t xml:space="preserve">— it is a section of the report, not the answer-box abstract. Vague answers score zero.]</w:t>
       </w:r>
     </w:p>
     <w:p>
@@ -471,13 +817,13 @@
           <w:b/>
           <w:bCs/>
         </w:rPr>
-        <w:t xml:space="preserve">A CISO/Legal-readable executive summary</w:t>
-      </w:r>
-      <w:r>
-        <w:t xml:space="preserve"> </w:t>
-      </w:r>
-      <w:r>
-        <w:t xml:space="preserve">— could a non-analyst act on it? No raw logs up top.</w:t>
+        <w:t xml:space="preserve">A stand-alone executive summary</w:t>
+      </w:r>
+      <w:r>
+        <w:t xml:space="preserve"> </w:t>
+      </w:r>
+      <w:r>
+        <w:t xml:space="preserve">— a board member could act on it without reading further.</w:t>
       </w:r>
     </w:p>
     <w:p>
@@ -493,19 +839,13 @@
           <w:b/>
           <w:bCs/>
         </w:rPr>
-        <w:t xml:space="preserve">Root cause stated as a cause</w:t>
-      </w:r>
-      <w:r>
-        <w:t xml:space="preserve"> </w:t>
-      </w:r>
-      <w:r>
-        <w:t xml:space="preserve">— the foothold and the persistence mechanism, not</w:t>
-      </w:r>
-      <w:r>
-        <w:t xml:space="preserve"> </w:t>
-      </w:r>
-      <w:r>
-        <w:t xml:space="preserve">“malware was found.”</w:t>
+        <w:t xml:space="preserve">All sections present, in order, named correctly</w:t>
+      </w:r>
+      <w:r>
+        <w:t xml:space="preserve"> </w:t>
+      </w:r>
+      <w:r>
+        <w:t xml:space="preserve">— and 1,500+ words.</w:t>
       </w:r>
     </w:p>
     <w:p>
@@ -521,27 +861,34 @@
           <w:b/>
           <w:bCs/>
         </w:rPr>
-        <w:t xml:space="preserve">Accurate</w:t>
-      </w:r>
-      <w:r>
-        <w:rPr>
-          <w:b/>
-          <w:bCs/>
-        </w:rPr>
-        <w:t xml:space="preserve"> </w:t>
-      </w:r>
-      <w:r>
-        <w:rPr>
-          <w:b/>
-          <w:bCs/>
-        </w:rPr>
-        <w:t xml:space="preserve">“what was accessed”</w:t>
-      </w:r>
-      <w:r>
-        <w:t xml:space="preserve"> </w:t>
-      </w:r>
-      <w:r>
-        <w:t xml:space="preserve">— the exfiltrated data named precisely; Legal relies on this being right.</w:t>
+        <w:t xml:space="preserve">Root cause as a cause</w:t>
+      </w:r>
+      <w:r>
+        <w:t xml:space="preserve"> </w:t>
+      </w:r>
+      <w:r>
+        <w:t xml:space="preserve">— the compromised SSH key + the</w:t>
+      </w:r>
+      <w:r>
+        <w:t xml:space="preserve"> </w:t>
+      </w:r>
+      <w:r>
+        <w:rPr>
+          <w:rStyle w:val="VerbatimChar"/>
+        </w:rPr>
+        <w:t xml:space="preserve">sudo less</w:t>
+      </w:r>
+      <w:r>
+        <w:t xml:space="preserve"> </w:t>
+      </w:r>
+      <w:r>
+        <w:t xml:space="preserve">misconfiguration becoming persistent root — not</w:t>
+      </w:r>
+      <w:r>
+        <w:t xml:space="preserve"> </w:t>
+      </w:r>
+      <w:r>
+        <w:t xml:space="preserve">“malware ran.”</w:t>
       </w:r>
     </w:p>
     <w:p>
@@ -557,13 +904,13 @@
           <w:b/>
           <w:bCs/>
         </w:rPr>
-        <w:t xml:space="preserve">Containment + eradication that fit the evidence</w:t>
-      </w:r>
-      <w:r>
-        <w:t xml:space="preserve"> </w:t>
-      </w:r>
-      <w:r>
-        <w:t xml:space="preserve">— isolation already done, plus the specific artefacts and credentials to remove/rotate.</w:t>
+        <w:t xml:space="preserve">A real timeline table</w:t>
+      </w:r>
+      <w:r>
+        <w:t xml:space="preserve"> </w:t>
+      </w:r>
+      <w:r>
+        <w:t xml:space="preserve">— 12+ rows, with honest H/M/L confidence (not everything H) and ATT&amp;CK IDs.</w:t>
       </w:r>
     </w:p>
     <w:p>
@@ -579,13 +926,19 @@
           <w:b/>
           <w:bCs/>
         </w:rPr>
-        <w:t xml:space="preserve">Consistency with D1–D4</w:t>
-      </w:r>
-      <w:r>
-        <w:t xml:space="preserve"> </w:t>
-      </w:r>
-      <w:r>
-        <w:t xml:space="preserve">— the timeline, IOCs, and root cause match your other deliverables. Contradictions across your own pack cost marks.</w:t>
+        <w:t xml:space="preserve">Owned, dated lessons + a real risk register</w:t>
+      </w:r>
+      <w:r>
+        <w:t xml:space="preserve"> </w:t>
+      </w:r>
+      <w:r>
+        <w:t xml:space="preserve">— actions with owner roles and deadlines; risks that are not just</w:t>
+      </w:r>
+      <w:r>
+        <w:t xml:space="preserve"> </w:t>
+      </w:r>
+      <w:r>
+        <w:t xml:space="preserve">“we got breached.”</w:t>
       </w:r>
     </w:p>
     <w:p>
@@ -601,13 +954,35 @@
           <w:b/>
           <w:bCs/>
         </w:rPr>
-        <w:t xml:space="preserve">Lessons and policy that are specific</w:t>
-      </w:r>
-      <w:r>
-        <w:t xml:space="preserve"> </w:t>
-      </w:r>
-      <w:r>
-        <w:t xml:space="preserve">— each one traceable to something in this incident, not generic best practice.</w:t>
+        <w:t xml:space="preserve">The rejected-theory and one-mistake sections are specific</w:t>
+      </w:r>
+      <w:r>
+        <w:t xml:space="preserve"> </w:t>
+      </w:r>
+      <w:r>
+        <w:t xml:space="preserve">— these are the AI-resistant sections; generic answers score zero.</w:t>
+      </w:r>
+    </w:p>
+    <w:p>
+      <w:pPr>
+        <w:pStyle w:val="Compact"/>
+        <w:numPr>
+          <w:ilvl w:val="0"/>
+          <w:numId w:val="1003"/>
+        </w:numPr>
+      </w:pPr>
+      <w:r>
+        <w:rPr>
+          <w:b/>
+          <w:bCs/>
+        </w:rPr>
+        <w:t xml:space="preserve">8+ real citations</w:t>
+      </w:r>
+      <w:r>
+        <w:t xml:space="preserve"> </w:t>
+      </w:r>
+      <w:r>
+        <w:t xml:space="preserve">— NIST by section, ATT&amp;CK IDs, CISA, a detection reference, NDPA §40 — and consistency with your D1–D4.</w:t>
       </w:r>
     </w:p>
     <w:bookmarkEnd w:id="11"/>
@@ -656,7 +1031,7 @@
         </w:numPr>
       </w:pPr>
       <w:r>
-        <w:t xml:space="preserve">All nine sections present, in order, 5–7 pages.</w:t>
+        <w:t xml:space="preserve">All 15 sections present, in order, with the exact headings; 1,500+ words.</w:t>
       </w:r>
     </w:p>
     <w:p>
@@ -668,7 +1043,7 @@
         </w:numPr>
       </w:pPr>
       <w:r>
-        <w:t xml:space="preserve">Executive summary is jargon-free and decision-focused.</w:t>
+        <w:t xml:space="preserve">Timeline table has 12+ rows with the six columns incl. Confidence (not all H).</w:t>
       </w:r>
     </w:p>
     <w:p>
@@ -680,19 +1055,7 @@
         </w:numPr>
       </w:pPr>
       <w:r>
-        <w:t xml:space="preserve">Root cause is a cause;</w:t>
-      </w:r>
-      <w:r>
-        <w:t xml:space="preserve"> </w:t>
-      </w:r>
-      <w:r>
-        <w:t xml:space="preserve">“what was accessed”</w:t>
-      </w:r>
-      <w:r>
-        <w:t xml:space="preserve"> </w:t>
-      </w:r>
-      <w:r>
-        <w:t xml:space="preserve">names the actual data.</w:t>
+        <w:t xml:space="preserve">Rejected-alternate-theory and one-mistake sections are specific and inside the Doc.</w:t>
       </w:r>
     </w:p>
     <w:p>
@@ -704,7 +1067,7 @@
         </w:numPr>
       </w:pPr>
       <w:r>
-        <w:t xml:space="preserve">Timeline / IOCs / root cause are consistent with D2–D4.</w:t>
+        <w:t xml:space="preserve">8+ citations incl. NIST §, 4+ ATT&amp;CK IDs, CISA, a detection ref, and NDPA §40.</w:t>
       </w:r>
     </w:p>
     <w:p>
@@ -713,6 +1076,27 @@
         <w:numPr>
           <w:ilvl w:val="0"/>
           <w:numId w:val="1009"/>
+        </w:numPr>
+      </w:pPr>
+      <w:r>
+        <w:t xml:space="preserve">Doc sharing is</w:t>
+      </w:r>
+      <w:r>
+        <w:t xml:space="preserve"> </w:t>
+      </w:r>
+      <w:r>
+        <w:t xml:space="preserve">“Anyone with the link → Viewer”</w:t>
+      </w:r>
+      <w:r>
+        <w:t xml:space="preserve">; answer box has the URL + 100-word abstract.</w:t>
+      </w:r>
+    </w:p>
+    <w:p>
+      <w:pPr>
+        <w:pStyle w:val="Compact"/>
+        <w:numPr>
+          <w:ilvl w:val="0"/>
+          <w:numId w:val="1010"/>
         </w:numPr>
       </w:pPr>
       <w:r>
@@ -1201,6 +1585,9 @@
     <w:abstractNumId w:val="992"/>
   </w:num>
   <w:num w:numId="1009">
+    <w:abstractNumId w:val="992"/>
+  </w:num>
+  <w:num w:numId="1010">
     <w:abstractNumId w:val="992"/>
   </w:num>
 </w:numbering>

</xml_diff>

<commit_message>
Remove accidental grading artifacts from main
</commit_message>
<xml_diff>
--- a/public/capstone/stage-3/stage-3-incident-report-template.docx
+++ b/public/capstone/stage-3/stage-3-incident-report-template.docx
@@ -23,7 +23,7 @@
           <w:i/>
           <w:iCs/>
         </w:rPr>
-        <w:t xml:space="preserve">Editable template — Deliverable 5 of 5: The Incident Response Report (PICERL). This is the document Sankofa’s response stands or falls on — Legal, the board, and the regulator all read it. It follows the NIST SP 800-61r2 PICERL lifecycle, and it folds in your triage, timeline, IOCs, and ATT&amp;CK map. Minimum 1,500 words. Submit the Google Doc link + a 100+ word abstract in the answer box. Edit in Google Docs (recommended). Replace every [BRACKETED] prompt and delete every grey guidance line before you submit.</w:t>
+        <w:t xml:space="preserve">Editable template — Deliverable 5 of 5: The formal incident report. This is the cover report for the CISO and Legal — it folds in your triage, timeline, IOCs, and ATT&amp;CK map and tells the story a non-analyst can act and decide on. Target length 5–7 pages. Edit in Google Docs (recommended). Replace every [BRACKETED] prompt and delete every grey guidance line before you submit.</w:t>
       </w:r>
     </w:p>
     <w:p>
@@ -33,13 +33,13 @@
         </w:pict>
       </w:r>
     </w:p>
-    <w:bookmarkStart w:id="14" w:name="Xe1979b2d58810cfc48621bf922a469865bf1d52"/>
+    <w:bookmarkStart w:id="14" w:name="deliverable-5-the-formal-incident-report"/>
     <w:p>
       <w:pPr>
         <w:pStyle w:val="Heading1"/>
       </w:pPr>
       <w:r>
-        <w:t xml:space="preserve">Deliverable 5 — Incident Response Report (PICERL)</w:t>
+        <w:t xml:space="preserve">Deliverable 5 — The formal incident report</w:t>
       </w:r>
     </w:p>
     <w:bookmarkStart w:id="9" w:name="before-you-start"/>
@@ -70,13 +70,13 @@
           <w:b/>
           <w:bCs/>
         </w:rPr>
-        <w:t xml:space="preserve">Legal, the board, the regulator.</w:t>
-      </w:r>
-      <w:r>
-        <w:t xml:space="preserve"> </w:t>
-      </w:r>
-      <w:r>
-        <w:t xml:space="preserve">Facts, impact, decisions — keep raw log lines in the appendix and reference them.</w:t>
+        <w:t xml:space="preserve">CISO + Legal.</w:t>
+      </w:r>
+      <w:r>
+        <w:t xml:space="preserve"> </w:t>
+      </w:r>
+      <w:r>
+        <w:t xml:space="preserve">They need the facts, the impact, and the decisions — not raw log lines. Keep the analyst detail in D1–D4 and reference it.</w:t>
       </w:r>
     </w:p>
     <w:p>
@@ -88,7 +88,7 @@
         </w:numPr>
       </w:pPr>
       <w:r>
-        <w:t xml:space="preserve">Use the</w:t>
+        <w:t xml:space="preserve">It must be</w:t>
       </w:r>
       <w:r>
         <w:t xml:space="preserve"> </w:t>
@@ -98,13 +98,13 @@
           <w:b/>
           <w:bCs/>
         </w:rPr>
-        <w:t xml:space="preserve">exact section headings below, in this order</w:t>
-      </w:r>
-      <w:r>
-        <w:t xml:space="preserve"> </w:t>
-      </w:r>
-      <w:r>
-        <w:t xml:space="preserve">(NIST SP 800-61r2 PICERL). Graders look for them by name.</w:t>
+        <w:t xml:space="preserve">internally consistent</w:t>
+      </w:r>
+      <w:r>
+        <w:t xml:space="preserve"> </w:t>
+      </w:r>
+      <w:r>
+        <w:t xml:space="preserve">with your other four deliverables: the timeline, the IOCs, and the root cause should match what you submitted there.</w:t>
       </w:r>
     </w:p>
     <w:p>
@@ -116,7 +116,7 @@
         </w:numPr>
       </w:pPr>
       <w:r>
-        <w:t xml:space="preserve">It must be</w:t>
+        <w:t xml:space="preserve">Root cause is a</w:t>
       </w:r>
       <w:r>
         <w:t xml:space="preserve"> </w:t>
@@ -126,13 +126,19 @@
           <w:b/>
           <w:bCs/>
         </w:rPr>
-        <w:t xml:space="preserve">internally consistent</w:t>
-      </w:r>
-      <w:r>
-        <w:t xml:space="preserve"> </w:t>
-      </w:r>
-      <w:r>
-        <w:t xml:space="preserve">with your D1–D4: the timeline, the IOCs, the root cause all match.</w:t>
+        <w:t xml:space="preserve">cause, not a symptom.</w:t>
+      </w:r>
+      <w:r>
+        <w:t xml:space="preserve"> </w:t>
+      </w:r>
+      <w:r>
+        <w:t xml:space="preserve">“Malware ran”</w:t>
+      </w:r>
+      <w:r>
+        <w:t xml:space="preserve"> </w:t>
+      </w:r>
+      <w:r>
+        <w:t xml:space="preserve">is a symptom; the cause is how the attacker got a foothold and how that became persistent root.</w:t>
       </w:r>
     </w:p>
     <w:p>
@@ -144,55 +150,23 @@
         </w:numPr>
       </w:pPr>
       <w:r>
+        <w:t xml:space="preserve">Be exact about</w:t>
+      </w:r>
+      <w:r>
+        <w:t xml:space="preserve"> </w:t>
+      </w:r>
+      <w:r>
         <w:rPr>
           <w:b/>
           <w:bCs/>
         </w:rPr>
-        <w:t xml:space="preserve">Minimum 1,500 words.</w:t>
-      </w:r>
-      <w:r>
-        <w:t xml:space="preserve"> </w:t>
-      </w:r>
-      <w:r>
-        <w:t xml:space="preserve">No section shorter than two sentences; no section longer than ~350 words except the appendix and the timeline.</w:t>
-      </w:r>
-    </w:p>
-    <w:p>
-      <w:pPr>
-        <w:pStyle w:val="Compact"/>
-        <w:numPr>
-          <w:ilvl w:val="0"/>
-          <w:numId w:val="1001"/>
-        </w:numPr>
-      </w:pPr>
-      <w:r>
-        <w:rPr>
-          <w:b/>
-          <w:bCs/>
-        </w:rPr>
-        <w:t xml:space="preserve">Citations required (8+):</w:t>
-      </w:r>
-      <w:r>
-        <w:t xml:space="preserve"> </w:t>
-      </w:r>
-      <w:r>
-        <w:t xml:space="preserve">NIST SP 800-61r2 by section number, 4+ MITRE ATT&amp;CK technique IDs, 1+ CISA playbook, 1+ detection-engineering reference (Sigma / Wazuh / osquery / Falco / Atomic Red Team), and one sentence flagging</w:t>
-      </w:r>
-      <w:r>
-        <w:t xml:space="preserve"> </w:t>
-      </w:r>
-      <w:r>
-        <w:rPr>
-          <w:b/>
-          <w:bCs/>
-        </w:rPr>
-        <w:t xml:space="preserve">NDPA 2023 §40</w:t>
-      </w:r>
-      <w:r>
-        <w:t xml:space="preserve"> </w:t>
-      </w:r>
-      <w:r>
-        <w:t xml:space="preserve">applicability.</w:t>
+        <w:t xml:space="preserve">what was accessed</w:t>
+      </w:r>
+      <w:r>
+        <w:t xml:space="preserve"> </w:t>
+      </w:r>
+      <w:r>
+        <w:t xml:space="preserve">— name the data that left the host. Legal acts on this.</w:t>
       </w:r>
     </w:p>
     <w:p>
@@ -200,7 +174,7 @@
         <w:pStyle w:val="BlockText"/>
       </w:pPr>
       <w:r>
-        <w:t xml:space="preserve">This is a scaffold, not an answer key. The analysis is yours; this gives you the section order and the bar graders expect.</w:t>
+        <w:t xml:space="preserve">This is a scaffold, not an answer key. The analysis is yours; this gives you the section order graders expect.</w:t>
       </w:r>
     </w:p>
     <w:p>
@@ -225,36 +199,28 @@
         <w:pStyle w:val="FirstParagraph"/>
       </w:pPr>
       <w:r>
-        <w:t xml:space="preserve">A Google Doc (≥1,500 words), sharing set to</w:t>
-      </w:r>
-      <w:r>
-        <w:t xml:space="preserve"> </w:t>
-      </w:r>
+        <w:t xml:space="preserve">A 5–7 page document (</w:t>
+      </w:r>
+      <w:r>
+        <w:rPr>
+          <w:rStyle w:val="VerbatimChar"/>
+        </w:rPr>
+        <w:t xml:space="preserve">incident-report</w:t>
+      </w:r>
+      <w:r>
+        <w:t xml:space="preserve">) with the sections below, in this order.</w:t>
+      </w:r>
+    </w:p>
+    <w:p>
+      <w:pPr>
+        <w:pStyle w:val="BodyText"/>
+      </w:pPr>
       <w:r>
         <w:rPr>
           <w:b/>
           <w:bCs/>
         </w:rPr>
-        <w:t xml:space="preserve">“Anyone with the link → Viewer.”</w:t>
-      </w:r>
-      <w:r>
-        <w:t xml:space="preserve"> </w:t>
-      </w:r>
-      <w:r>
-        <w:t xml:space="preserve">In the answer box paste the</w:t>
-      </w:r>
-      <w:r>
-        <w:t xml:space="preserve"> </w:t>
-      </w:r>
-      <w:r>
-        <w:rPr>
-          <w:b/>
-          <w:bCs/>
-        </w:rPr>
-        <w:t xml:space="preserve">Doc URL + a 100+ word abstract</w:t>
-      </w:r>
-      <w:r>
-        <w:t xml:space="preserve">. The report itself contains the sections below.</w:t>
+        <w:t xml:space="preserve">First line of your document:</w:t>
       </w:r>
     </w:p>
     <w:p>
@@ -263,31 +229,19 @@
       </w:pPr>
       <w:r>
         <w:rPr>
-          <w:b/>
-          <w:bCs/>
-        </w:rPr>
-        <w:t xml:space="preserve">First line of your document:</w:t>
-      </w:r>
-    </w:p>
-    <w:p>
-      <w:pPr>
-        <w:pStyle w:val="BodyText"/>
-      </w:pPr>
-      <w:r>
-        <w:rPr>
           <w:rStyle w:val="VerbatimChar"/>
         </w:rPr>
         <w:t xml:space="preserve">Stage 3 · Incident report · [Your Full Name] · [UBI-2026-####]</w:t>
       </w:r>
     </w:p>
     <w:bookmarkEnd w:id="10"/>
-    <w:bookmarkStart w:id="13" w:name="Xdbdc1bd9007e2664e3d21c161e034ca6902b750"/>
+    <w:bookmarkStart w:id="13" w:name="section-order-use-these-headings"/>
     <w:p>
       <w:pPr>
         <w:pStyle w:val="Heading2"/>
       </w:pPr>
       <w:r>
-        <w:t xml:space="preserve">Required sections (these headings, in this order)</w:t>
+        <w:t xml:space="preserve">Section order (use these headings)</w:t>
       </w:r>
     </w:p>
     <w:p>
@@ -309,7 +263,7 @@
         <w:t xml:space="preserve"> </w:t>
       </w:r>
       <w:r>
-        <w:t xml:space="preserve">(≤200 words) — [what happened in plain language, what was lost/exposed, what is contained, what is NOT yet contained, and the action the board is asked to authorise. A reader who stops here can still brief their boss.]</w:t>
+        <w:t xml:space="preserve">— [6–10 lines a CISO/Legal reader understands with no jargon: what happened, on which host, what data was at risk, and the one decision or action that matters most.]</w:t>
       </w:r>
     </w:p>
     <w:p>
@@ -331,7 +285,7 @@
         <w:t xml:space="preserve"> </w:t>
       </w:r>
       <w:r>
-        <w:t xml:space="preserve">— [hosts, users, and data classes in scope (and out of scope) — one short paragraph each.]</w:t>
+        <w:t xml:space="preserve">— [the host(s), the user account, the time window, and what was in and out of scope for this investigation.]</w:t>
       </w:r>
     </w:p>
     <w:p>
@@ -347,28 +301,13 @@
           <w:b/>
           <w:bCs/>
         </w:rPr>
-        <w:t xml:space="preserve">Preparation — what worked / what didn’t</w:t>
-      </w:r>
-      <w:r>
-        <w:t xml:space="preserve"> </w:t>
-      </w:r>
-      <w:r>
-        <w:t xml:space="preserve">— [Sankofa’s pre-incident posture. Did detection catch the beacon? Was the</w:t>
-      </w:r>
-      <w:r>
-        <w:t xml:space="preserve"> </w:t>
-      </w:r>
-      <w:r>
-        <w:rPr>
-          <w:rStyle w:val="VerbatimChar"/>
-        </w:rPr>
-        <w:t xml:space="preserve">sudoers.d</w:t>
-      </w:r>
-      <w:r>
-        <w:t xml:space="preserve"> </w:t>
-      </w:r>
-      <w:r>
-        <w:t xml:space="preserve">change reviewed? Cite the evidence for each control that was present or absent.]</w:t>
+        <w:t xml:space="preserve">Timeline (summary)</w:t>
+      </w:r>
+      <w:r>
+        <w:t xml:space="preserve"> </w:t>
+      </w:r>
+      <w:r>
+        <w:t xml:space="preserve">— [the condensed version of D2 — the key events in order. Reference the full timeline deliverable; do not paste all rows.]</w:t>
       </w:r>
     </w:p>
     <w:p>
@@ -384,13 +323,13 @@
           <w:b/>
           <w:bCs/>
         </w:rPr>
-        <w:t xml:space="preserve">Identification — how we found it</w:t>
-      </w:r>
-      <w:r>
-        <w:t xml:space="preserve"> </w:t>
-      </w:r>
-      <w:r>
-        <w:t xml:space="preserve">— [the detection that triggered investigation; the forensic artefacts you pulled (memory dump, filesystem index, syslog, SIEM, netflow); chain of custody.]</w:t>
+        <w:t xml:space="preserve">Root cause</w:t>
+      </w:r>
+      <w:r>
+        <w:t xml:space="preserve"> </w:t>
+      </w:r>
+      <w:r>
+        <w:t xml:space="preserve">— [how the attacker got in and how that became persistent root access. Cause, not symptom. Tie it to the evidence.]</w:t>
       </w:r>
     </w:p>
     <w:p>
@@ -406,13 +345,13 @@
           <w:b/>
           <w:bCs/>
         </w:rPr>
-        <w:t xml:space="preserve">Containment — what stopped the bleeding</w:t>
-      </w:r>
-      <w:r>
-        <w:t xml:space="preserve"> </w:t>
-      </w:r>
-      <w:r>
-        <w:t xml:space="preserve">— [hosts isolated, credentials rotated, network rules pushed, and the ORDER you did them in — justify each ordering choice.]</w:t>
+        <w:t xml:space="preserve">What was accessed / impact</w:t>
+      </w:r>
+      <w:r>
+        <w:t xml:space="preserve"> </w:t>
+      </w:r>
+      <w:r>
+        <w:t xml:space="preserve">— [name the data that was bundled and exfiltrated, and the business impact. Be specific about the files and what they contained.]</w:t>
       </w:r>
     </w:p>
     <w:p>
@@ -428,67 +367,13 @@
           <w:b/>
           <w:bCs/>
         </w:rPr>
-        <w:t xml:space="preserve">Eradication — what got removed</w:t>
-      </w:r>
-      <w:r>
-        <w:t xml:space="preserve"> </w:t>
-      </w:r>
-      <w:r>
-        <w:t xml:space="preserve">— [the persistence removed (the</w:t>
-      </w:r>
-      <w:r>
-        <w:t xml:space="preserve"> </w:t>
-      </w:r>
-      <w:r>
-        <w:rPr>
-          <w:rStyle w:val="VerbatimChar"/>
-        </w:rPr>
-        <w:t xml:space="preserve">.bashrc</w:t>
-      </w:r>
-      <w:r>
-        <w:t xml:space="preserve"> </w:t>
-      </w:r>
-      <w:r>
-        <w:rPr>
-          <w:rStyle w:val="VerbatimChar"/>
-        </w:rPr>
-        <w:t xml:space="preserve">source</w:t>
-      </w:r>
-      <w:r>
-        <w:t xml:space="preserve"> </w:t>
-      </w:r>
-      <w:r>
-        <w:t xml:space="preserve">line, the</w:t>
-      </w:r>
-      <w:r>
-        <w:t xml:space="preserve"> </w:t>
-      </w:r>
-      <w:r>
-        <w:rPr>
-          <w:rStyle w:val="VerbatimChar"/>
-        </w:rPr>
-        <w:t xml:space="preserve">.helper</w:t>
-      </w:r>
-      <w:r>
-        <w:t xml:space="preserve"> </w:t>
-      </w:r>
-      <w:r>
-        <w:t xml:space="preserve">binary, the autostart entry, the cron); the sudoers entry fixed; any pivoted credentials revoked; the C2 domain</w:t>
-      </w:r>
-      <w:r>
-        <w:t xml:space="preserve"> </w:t>
-      </w:r>
-      <w:r>
-        <w:rPr>
-          <w:rStyle w:val="VerbatimChar"/>
-        </w:rPr>
-        <w:t xml:space="preserve">gri0t-c2.dynamic-update.net</w:t>
-      </w:r>
-      <w:r>
-        <w:t xml:space="preserve"> </w:t>
-      </w:r>
-      <w:r>
-        <w:t xml:space="preserve">sinkholed/blocked.]</w:t>
+        <w:t xml:space="preserve">Containment</w:t>
+      </w:r>
+      <w:r>
+        <w:t xml:space="preserve"> </w:t>
+      </w:r>
+      <w:r>
+        <w:t xml:space="preserve">— [what was done to stop it — e.g. host isolation — with the timestamp, and what should happen next.]</w:t>
       </w:r>
     </w:p>
     <w:p>
@@ -504,13 +389,13 @@
           <w:b/>
           <w:bCs/>
         </w:rPr>
-        <w:t xml:space="preserve">Recovery — how we returned to normal</w:t>
-      </w:r>
-      <w:r>
-        <w:t xml:space="preserve"> </w:t>
-      </w:r>
-      <w:r>
-        <w:t xml:space="preserve">— [reimage vs in-place clean; restore vs rebuild; the validation step that confirmed eradication (fresh image, fresh keys, monitored 72h with no beacons).]</w:t>
+        <w:t xml:space="preserve">Eradication</w:t>
+      </w:r>
+      <w:r>
+        <w:t xml:space="preserve"> </w:t>
+      </w:r>
+      <w:r>
+        <w:t xml:space="preserve">— [removing the foothold: the persistence mechanism(s), the attacker’s access path, and any credentials/keys that must be rotated.]</w:t>
       </w:r>
     </w:p>
     <w:p>
@@ -526,13 +411,13 @@
           <w:b/>
           <w:bCs/>
         </w:rPr>
-        <w:t xml:space="preserve">Lessons learned — three actions</w:t>
-      </w:r>
-      <w:r>
-        <w:t xml:space="preserve"> </w:t>
-      </w:r>
-      <w:r>
-        <w:t xml:space="preserve">— [three concrete actions, each with a named owner ROLE and a deadline, each backed by an artefact in this incident. Not platitudes.]</w:t>
+        <w:t xml:space="preserve">Lessons learned</w:t>
+      </w:r>
+      <w:r>
+        <w:t xml:space="preserve"> </w:t>
+      </w:r>
+      <w:r>
+        <w:t xml:space="preserve">— [what the incident exposed about detection and response gaps — specific, not platitudes.]</w:t>
       </w:r>
     </w:p>
     <w:p>
@@ -548,244 +433,13 @@
           <w:b/>
           <w:bCs/>
         </w:rPr>
-        <w:t xml:space="preserve">Timeline table</w:t>
-      </w:r>
-      <w:r>
-        <w:t xml:space="preserve"> </w:t>
-      </w:r>
-      <w:r>
-        <w:t xml:space="preserve">— [reuse/refine your D2 timeline. Columns exactly:</w:t>
-      </w:r>
-      <w:r>
-        <w:t xml:space="preserve"> </w:t>
-      </w:r>
-      <w:r>
-        <w:rPr>
-          <w:rStyle w:val="VerbatimChar"/>
-        </w:rPr>
-        <w:t xml:space="preserve">Timestamp UTC | Event | Evidence (path or tab:timestamp) | ATT&amp;CK ID | Confidence (H/M/L) | Confidence rationale (≤25 words)</w:t>
-      </w:r>
-      <w:r>
-        <w:t xml:space="preserve">.</w:t>
-      </w:r>
-      <w:r>
-        <w:t xml:space="preserve"> </w:t>
-      </w:r>
-      <w:r>
-        <w:rPr>
-          <w:b/>
-          <w:bCs/>
-        </w:rPr>
-        <w:t xml:space="preserve">Minimum 12 rows.</w:t>
-      </w:r>
-      <w:r>
-        <w:t xml:space="preserve"> </w:t>
-      </w:r>
-      <w:r>
-        <w:t xml:space="preserve">H = direct evidence; M = correlated/indirect; L = inferred from absence. A table that is all H is wrong — real IR has uncertainty.]</w:t>
-      </w:r>
-    </w:p>
-    <w:p>
-      <w:pPr>
-        <w:pStyle w:val="Compact"/>
-        <w:numPr>
-          <w:ilvl w:val="0"/>
-          <w:numId w:val="1002"/>
-        </w:numPr>
-      </w:pPr>
-      <w:r>
-        <w:rPr>
-          <w:b/>
-          <w:bCs/>
-        </w:rPr>
-        <w:t xml:space="preserve">ATT&amp;CK map summary</w:t>
-      </w:r>
-      <w:r>
-        <w:t xml:space="preserve"> </w:t>
-      </w:r>
-      <w:r>
-        <w:t xml:space="preserve">— [reference your D4; restate the</w:t>
-      </w:r>
-      <w:r>
-        <w:t xml:space="preserve"> </w:t>
-      </w:r>
-      <w:r>
-        <w:rPr>
-          <w:b/>
-          <w:bCs/>
-        </w:rPr>
-        <w:t xml:space="preserve">top 6</w:t>
-      </w:r>
-      <w:r>
-        <w:t xml:space="preserve"> </w:t>
-      </w:r>
-      <w:r>
-        <w:t xml:space="preserve">techniques here with a one-line justification each.]</w:t>
-      </w:r>
-    </w:p>
-    <w:p>
-      <w:pPr>
-        <w:pStyle w:val="Compact"/>
-        <w:numPr>
-          <w:ilvl w:val="0"/>
-          <w:numId w:val="1002"/>
-        </w:numPr>
-      </w:pPr>
-      <w:r>
-        <w:rPr>
-          <w:b/>
-          <w:bCs/>
-        </w:rPr>
-        <w:t xml:space="preserve">Risk register update</w:t>
-      </w:r>
-      <w:r>
-        <w:t xml:space="preserve"> </w:t>
-      </w:r>
-      <w:r>
-        <w:t xml:space="preserve">— [three NEW risks this incident surfaces — e.g. </w:t>
-      </w:r>
-      <w:r>
-        <w:t xml:space="preserve">“unreviewed sudoers grants survive indefinitely”</w:t>
-      </w:r>
-      <w:r>
-        <w:t xml:space="preserve"> </w:t>
-      </w:r>
-      <w:r>
-        <w:t xml:space="preserve">— each with likelihood × impact and a proposed control. Not</w:t>
-      </w:r>
-      <w:r>
-        <w:t xml:space="preserve"> </w:t>
-      </w:r>
-      <w:r>
-        <w:t xml:space="preserve">“we got breached.”</w:t>
-      </w:r>
-      <w:r>
-        <w:t xml:space="preserve">]</w:t>
-      </w:r>
-    </w:p>
-    <w:p>
-      <w:pPr>
-        <w:pStyle w:val="Compact"/>
-        <w:numPr>
-          <w:ilvl w:val="0"/>
-          <w:numId w:val="1002"/>
-        </w:numPr>
-      </w:pPr>
-      <w:r>
-        <w:rPr>
-          <w:b/>
-          <w:bCs/>
-        </w:rPr>
-        <w:t xml:space="preserve">References (8+)</w:t>
-      </w:r>
-      <w:r>
-        <w:t xml:space="preserve"> </w:t>
-      </w:r>
-      <w:r>
-        <w:t xml:space="preserve">— [NIST SP 800-61r2 by section (e.g. §2 lifecycle, §3.3.4 containment); 4+ MITRE ATT&amp;CK IDs; 1+ CISA playbook; 1+ detection reference; NDPA 2023 §40 with a one-line note on whether this breach meets the notification threshold.]</w:t>
-      </w:r>
-    </w:p>
-    <w:p>
-      <w:pPr>
-        <w:pStyle w:val="Compact"/>
-        <w:numPr>
-          <w:ilvl w:val="0"/>
-          <w:numId w:val="1002"/>
-        </w:numPr>
-      </w:pPr>
-      <w:r>
-        <w:rPr>
-          <w:b/>
-          <w:bCs/>
-        </w:rPr>
-        <w:t xml:space="preserve">Evidence appendix</w:t>
-      </w:r>
-      <w:r>
-        <w:t xml:space="preserve"> </w:t>
-      </w:r>
-      <w:r>
-        <w:t xml:space="preserve">— [every file, tab, timestamp, command, ATT&amp;CK ID, and external reference cited above, in one numbered list.]</w:t>
-      </w:r>
-    </w:p>
-    <w:p>
-      <w:pPr>
-        <w:pStyle w:val="Compact"/>
-        <w:numPr>
-          <w:ilvl w:val="0"/>
-          <w:numId w:val="1002"/>
-        </w:numPr>
-      </w:pPr>
-      <w:r>
-        <w:rPr>
-          <w:b/>
-          <w:bCs/>
-        </w:rPr>
-        <w:t xml:space="preserve">Rejected alternate theory</w:t>
-      </w:r>
-      <w:r>
-        <w:t xml:space="preserve"> </w:t>
-      </w:r>
-      <w:r>
-        <w:t xml:space="preserve">(80+ words) — [one plausible explanation you considered and REJECTED, with the artefact that ruled it out. Generic</w:t>
-      </w:r>
-      <w:r>
-        <w:t xml:space="preserve"> </w:t>
-      </w:r>
-      <w:r>
-        <w:t xml:space="preserve">“I considered other theories”</w:t>
-      </w:r>
-      <w:r>
-        <w:t xml:space="preserve"> </w:t>
-      </w:r>
-      <w:r>
-        <w:t xml:space="preserve">scores zero. Example shape:</w:t>
-      </w:r>
-      <w:r>
-        <w:t xml:space="preserve"> </w:t>
-      </w:r>
-      <w:r>
-        <w:t xml:space="preserve">“I considered direct insider abuse by o.adegoke — ruled out by [the artefact that disproves it].”</w:t>
-      </w:r>
-      <w:r>
-        <w:t xml:space="preserve">]</w:t>
-      </w:r>
-    </w:p>
-    <w:p>
-      <w:pPr>
-        <w:pStyle w:val="Compact"/>
-        <w:numPr>
-          <w:ilvl w:val="0"/>
-          <w:numId w:val="1002"/>
-        </w:numPr>
-      </w:pPr>
-      <w:r>
-        <w:rPr>
-          <w:b/>
-          <w:bCs/>
-        </w:rPr>
-        <w:t xml:space="preserve">One mistake I almost made</w:t>
-      </w:r>
-      <w:r>
-        <w:t xml:space="preserve"> </w:t>
-      </w:r>
-      <w:r>
-        <w:t xml:space="preserve">(80+ words) — [a specific drafting moment: the order of containment vs eradication, nearly understating the blast radius, or missing logs misleading you. This goes</w:t>
-      </w:r>
-      <w:r>
-        <w:t xml:space="preserve"> </w:t>
-      </w:r>
-      <w:r>
-        <w:rPr>
-          <w:b/>
-          <w:bCs/>
-        </w:rPr>
-        <w:t xml:space="preserve">inside the Doc</w:t>
-      </w:r>
-      <w:r>
-        <w:t xml:space="preserve"> </w:t>
-      </w:r>
-      <w:r>
-        <w:t xml:space="preserve">— it is a section of the report, not the answer-box abstract. Vague answers score zero.]</w:t>
+        <w:t xml:space="preserve">Policy changes proposed</w:t>
+      </w:r>
+      <w:r>
+        <w:t xml:space="preserve"> </w:t>
+      </w:r>
+      <w:r>
+        <w:t xml:space="preserve">— [concrete changes — access control, logging/alerting, key hygiene — each tied to something this incident proved.]</w:t>
       </w:r>
     </w:p>
     <w:p>
@@ -817,13 +471,13 @@
           <w:b/>
           <w:bCs/>
         </w:rPr>
-        <w:t xml:space="preserve">A stand-alone executive summary</w:t>
-      </w:r>
-      <w:r>
-        <w:t xml:space="preserve"> </w:t>
-      </w:r>
-      <w:r>
-        <w:t xml:space="preserve">— a board member could act on it without reading further.</w:t>
+        <w:t xml:space="preserve">A CISO/Legal-readable executive summary</w:t>
+      </w:r>
+      <w:r>
+        <w:t xml:space="preserve"> </w:t>
+      </w:r>
+      <w:r>
+        <w:t xml:space="preserve">— could a non-analyst act on it? No raw logs up top.</w:t>
       </w:r>
     </w:p>
     <w:p>
@@ -839,13 +493,19 @@
           <w:b/>
           <w:bCs/>
         </w:rPr>
-        <w:t xml:space="preserve">All sections present, in order, named correctly</w:t>
-      </w:r>
-      <w:r>
-        <w:t xml:space="preserve"> </w:t>
-      </w:r>
-      <w:r>
-        <w:t xml:space="preserve">— and 1,500+ words.</w:t>
+        <w:t xml:space="preserve">Root cause stated as a cause</w:t>
+      </w:r>
+      <w:r>
+        <w:t xml:space="preserve"> </w:t>
+      </w:r>
+      <w:r>
+        <w:t xml:space="preserve">— the foothold and the persistence mechanism, not</w:t>
+      </w:r>
+      <w:r>
+        <w:t xml:space="preserve"> </w:t>
+      </w:r>
+      <w:r>
+        <w:t xml:space="preserve">“malware was found.”</w:t>
       </w:r>
     </w:p>
     <w:p>
@@ -861,34 +521,27 @@
           <w:b/>
           <w:bCs/>
         </w:rPr>
-        <w:t xml:space="preserve">Root cause as a cause</w:t>
-      </w:r>
-      <w:r>
-        <w:t xml:space="preserve"> </w:t>
-      </w:r>
-      <w:r>
-        <w:t xml:space="preserve">— the compromised SSH key + the</w:t>
-      </w:r>
-      <w:r>
-        <w:t xml:space="preserve"> </w:t>
-      </w:r>
-      <w:r>
-        <w:rPr>
-          <w:rStyle w:val="VerbatimChar"/>
-        </w:rPr>
-        <w:t xml:space="preserve">sudo less</w:t>
-      </w:r>
-      <w:r>
-        <w:t xml:space="preserve"> </w:t>
-      </w:r>
-      <w:r>
-        <w:t xml:space="preserve">misconfiguration becoming persistent root — not</w:t>
-      </w:r>
-      <w:r>
-        <w:t xml:space="preserve"> </w:t>
-      </w:r>
-      <w:r>
-        <w:t xml:space="preserve">“malware ran.”</w:t>
+        <w:t xml:space="preserve">Accurate</w:t>
+      </w:r>
+      <w:r>
+        <w:rPr>
+          <w:b/>
+          <w:bCs/>
+        </w:rPr>
+        <w:t xml:space="preserve"> </w:t>
+      </w:r>
+      <w:r>
+        <w:rPr>
+          <w:b/>
+          <w:bCs/>
+        </w:rPr>
+        <w:t xml:space="preserve">“what was accessed”</w:t>
+      </w:r>
+      <w:r>
+        <w:t xml:space="preserve"> </w:t>
+      </w:r>
+      <w:r>
+        <w:t xml:space="preserve">— the exfiltrated data named precisely; Legal relies on this being right.</w:t>
       </w:r>
     </w:p>
     <w:p>
@@ -904,13 +557,13 @@
           <w:b/>
           <w:bCs/>
         </w:rPr>
-        <w:t xml:space="preserve">A real timeline table</w:t>
-      </w:r>
-      <w:r>
-        <w:t xml:space="preserve"> </w:t>
-      </w:r>
-      <w:r>
-        <w:t xml:space="preserve">— 12+ rows, with honest H/M/L confidence (not everything H) and ATT&amp;CK IDs.</w:t>
+        <w:t xml:space="preserve">Containment + eradication that fit the evidence</w:t>
+      </w:r>
+      <w:r>
+        <w:t xml:space="preserve"> </w:t>
+      </w:r>
+      <w:r>
+        <w:t xml:space="preserve">— isolation already done, plus the specific artefacts and credentials to remove/rotate.</w:t>
       </w:r>
     </w:p>
     <w:p>
@@ -926,19 +579,13 @@
           <w:b/>
           <w:bCs/>
         </w:rPr>
-        <w:t xml:space="preserve">Owned, dated lessons + a real risk register</w:t>
-      </w:r>
-      <w:r>
-        <w:t xml:space="preserve"> </w:t>
-      </w:r>
-      <w:r>
-        <w:t xml:space="preserve">— actions with owner roles and deadlines; risks that are not just</w:t>
-      </w:r>
-      <w:r>
-        <w:t xml:space="preserve"> </w:t>
-      </w:r>
-      <w:r>
-        <w:t xml:space="preserve">“we got breached.”</w:t>
+        <w:t xml:space="preserve">Consistency with D1–D4</w:t>
+      </w:r>
+      <w:r>
+        <w:t xml:space="preserve"> </w:t>
+      </w:r>
+      <w:r>
+        <w:t xml:space="preserve">— the timeline, IOCs, and root cause match your other deliverables. Contradictions across your own pack cost marks.</w:t>
       </w:r>
     </w:p>
     <w:p>
@@ -954,35 +601,13 @@
           <w:b/>
           <w:bCs/>
         </w:rPr>
-        <w:t xml:space="preserve">The rejected-theory and one-mistake sections are specific</w:t>
-      </w:r>
-      <w:r>
-        <w:t xml:space="preserve"> </w:t>
-      </w:r>
-      <w:r>
-        <w:t xml:space="preserve">— these are the AI-resistant sections; generic answers score zero.</w:t>
-      </w:r>
-    </w:p>
-    <w:p>
-      <w:pPr>
-        <w:pStyle w:val="Compact"/>
-        <w:numPr>
-          <w:ilvl w:val="0"/>
-          <w:numId w:val="1003"/>
-        </w:numPr>
-      </w:pPr>
-      <w:r>
-        <w:rPr>
-          <w:b/>
-          <w:bCs/>
-        </w:rPr>
-        <w:t xml:space="preserve">8+ real citations</w:t>
-      </w:r>
-      <w:r>
-        <w:t xml:space="preserve"> </w:t>
-      </w:r>
-      <w:r>
-        <w:t xml:space="preserve">— NIST by section, ATT&amp;CK IDs, CISA, a detection reference, NDPA §40 — and consistency with your D1–D4.</w:t>
+        <w:t xml:space="preserve">Lessons and policy that are specific</w:t>
+      </w:r>
+      <w:r>
+        <w:t xml:space="preserve"> </w:t>
+      </w:r>
+      <w:r>
+        <w:t xml:space="preserve">— each one traceable to something in this incident, not generic best practice.</w:t>
       </w:r>
     </w:p>
     <w:bookmarkEnd w:id="11"/>
@@ -1031,7 +656,7 @@
         </w:numPr>
       </w:pPr>
       <w:r>
-        <w:t xml:space="preserve">All 15 sections present, in order, with the exact headings; 1,500+ words.</w:t>
+        <w:t xml:space="preserve">All nine sections present, in order, 5–7 pages.</w:t>
       </w:r>
     </w:p>
     <w:p>
@@ -1043,7 +668,7 @@
         </w:numPr>
       </w:pPr>
       <w:r>
-        <w:t xml:space="preserve">Timeline table has 12+ rows with the six columns incl. Confidence (not all H).</w:t>
+        <w:t xml:space="preserve">Executive summary is jargon-free and decision-focused.</w:t>
       </w:r>
     </w:p>
     <w:p>
@@ -1055,7 +680,19 @@
         </w:numPr>
       </w:pPr>
       <w:r>
-        <w:t xml:space="preserve">Rejected-alternate-theory and one-mistake sections are specific and inside the Doc.</w:t>
+        <w:t xml:space="preserve">Root cause is a cause;</w:t>
+      </w:r>
+      <w:r>
+        <w:t xml:space="preserve"> </w:t>
+      </w:r>
+      <w:r>
+        <w:t xml:space="preserve">“what was accessed”</w:t>
+      </w:r>
+      <w:r>
+        <w:t xml:space="preserve"> </w:t>
+      </w:r>
+      <w:r>
+        <w:t xml:space="preserve">names the actual data.</w:t>
       </w:r>
     </w:p>
     <w:p>
@@ -1067,7 +704,7 @@
         </w:numPr>
       </w:pPr>
       <w:r>
-        <w:t xml:space="preserve">8+ citations incl. NIST §, 4+ ATT&amp;CK IDs, CISA, a detection ref, and NDPA §40.</w:t>
+        <w:t xml:space="preserve">Timeline / IOCs / root cause are consistent with D2–D4.</w:t>
       </w:r>
     </w:p>
     <w:p>
@@ -1076,27 +713,6 @@
         <w:numPr>
           <w:ilvl w:val="0"/>
           <w:numId w:val="1009"/>
-        </w:numPr>
-      </w:pPr>
-      <w:r>
-        <w:t xml:space="preserve">Doc sharing is</w:t>
-      </w:r>
-      <w:r>
-        <w:t xml:space="preserve"> </w:t>
-      </w:r>
-      <w:r>
-        <w:t xml:space="preserve">“Anyone with the link → Viewer”</w:t>
-      </w:r>
-      <w:r>
-        <w:t xml:space="preserve">; answer box has the URL + 100-word abstract.</w:t>
-      </w:r>
-    </w:p>
-    <w:p>
-      <w:pPr>
-        <w:pStyle w:val="Compact"/>
-        <w:numPr>
-          <w:ilvl w:val="0"/>
-          <w:numId w:val="1010"/>
         </w:numPr>
       </w:pPr>
       <w:r>
@@ -1585,9 +1201,6 @@
     <w:abstractNumId w:val="992"/>
   </w:num>
   <w:num w:numId="1009">
-    <w:abstractNumId w:val="992"/>
-  </w:num>
-  <w:num w:numId="1010">
     <w:abstractNumId w:val="992"/>
   </w:num>
 </w:numbering>

</xml_diff>